<commit_message>
Resume: OSINT Intern @ Unknown (unknown)
</commit_message>
<xml_diff>
--- a/resumes/Resume_OSINT_Intern_Unknown__unknown_.docx
+++ b/resumes/Resume_OSINT_Intern_Unknown__unknown_.docx
@@ -588,7 +588,7 @@
           <w:sz w:val="19"/>
           <w:szCs w:val="19"/>
         </w:rPr>
-        <w:t>Deployed Splunk SIEM with SPL searches for brute-force detection, lateral movement, and privilege escalation, mapped to MITRE ATT&amp;CK TTPs and wrote incident report for FIRST.org.</w:t>
+        <w:t>Deployed Splunk SIEM with SPL searches for brute-force detection, lateral movement, and privilege escalation; mapped TTPs to MITRE ATT&amp;CK and wrote PICERL incident report for FIRST.org.</w:t>
       </w:r>
     </w:p>
     <w:p>
@@ -626,7 +626,7 @@
           <w:sz w:val="19"/>
           <w:szCs w:val="19"/>
         </w:rPr>
-        <w:t>Converted detection logic to Sigma rules, enabling vendor-neutral detection-as-code for enterprise SOCs; analyzed TCP/IP traffic in Wireshark for SYN scans, DNS tunnelling, and plaintext credential exposure.</w:t>
+        <w:t>Converted detection logic to Sigma rules for enterprise SOCs; analyzed TCP/IP traffic in Wireshark for SYN scans, DNS tunnelling, and plaintext credential exposure.</w:t>
       </w:r>
     </w:p>
     <w:p>
@@ -697,7 +697,7 @@
           <w:sz w:val="19"/>
           <w:szCs w:val="19"/>
         </w:rPr>
-        <w:t>Built automated vulnerability assessment pipeline integrating Nessus and OpenVAS REST APIs in Python; generated CVE reports classified by CVSS severity (vulnerability prioritisation) and EPSS context from the FIRST.org API.</w:t>
+        <w:t>Integrated Nessus and OpenVAS REST APIs in Python, generating CVE reports with CVSS severity and EPSS context from FIRST.org API.</w:t>
       </w:r>
     </w:p>
     <w:p>
@@ -716,7 +716,7 @@
           <w:sz w:val="19"/>
           <w:szCs w:val="19"/>
         </w:rPr>
-        <w:t>Developed OWASP Top 10 automated web checker to detect injection, auth, and SSRF vulnerabilities; documented SQL injection remediation.</w:t>
+        <w:t>Developed OWASP Top 10 automated web checker to detect injection, auth, and SSRF vulnerabilities, documenting SQL injection exploit and remediation.</w:t>
       </w:r>
     </w:p>
     <w:p>

</xml_diff>